<commit_message>
Agregar columna Enfermedades para Plagas
</commit_message>
<xml_diff>
--- a/BD/CLL_P08R01DB_MDRE.docx
+++ b/BD/CLL_P08R01DB_MDRE.docx
@@ -144,6 +144,7 @@
         </w:rPr>
         <w:t xml:space="preserve">R01MDRE </w:t>
       </w:r>
+      <w:proofErr w:type="spellStart"/>
       <w:r>
         <w:rPr>
           <w:rFonts w:ascii="Aptos" w:hAnsi="Aptos"/>
@@ -154,6 +155,7 @@
         </w:rPr>
         <w:t>ShopDB</w:t>
       </w:r>
+      <w:proofErr w:type="spellEnd"/>
     </w:p>
     <w:p>
       <w:pPr>
@@ -312,13 +314,23 @@
           <w:lang w:val="es-MX"/>
         </w:rPr>
       </w:pPr>
-      <w:r>
-        <w:rPr>
-          <w:rFonts w:ascii="Aptos" w:hAnsi="Aptos"/>
-          <w:sz w:val="22"/>
-          <w:lang w:val="es-MX"/>
-        </w:rPr>
-        <w:t xml:space="preserve">[ ] </w:t>
+      <w:proofErr w:type="gramStart"/>
+      <w:r>
+        <w:rPr>
+          <w:rFonts w:ascii="Aptos" w:hAnsi="Aptos"/>
+          <w:sz w:val="22"/>
+          <w:lang w:val="es-MX"/>
+        </w:rPr>
+        <w:t>[ ]</w:t>
+      </w:r>
+      <w:proofErr w:type="gramEnd"/>
+      <w:r>
+        <w:rPr>
+          <w:rFonts w:ascii="Aptos" w:hAnsi="Aptos"/>
+          <w:sz w:val="22"/>
+          <w:lang w:val="es-MX"/>
+        </w:rPr>
+        <w:t xml:space="preserve"> </w:t>
       </w:r>
       <w:r>
         <w:rPr>
@@ -369,13 +381,23 @@
           <w:lang w:val="es-MX"/>
         </w:rPr>
       </w:pPr>
-      <w:r>
-        <w:rPr>
-          <w:rFonts w:ascii="Aptos" w:hAnsi="Aptos"/>
-          <w:sz w:val="22"/>
-          <w:lang w:val="es-MX"/>
-        </w:rPr>
-        <w:t xml:space="preserve">[ ] </w:t>
+      <w:proofErr w:type="gramStart"/>
+      <w:r>
+        <w:rPr>
+          <w:rFonts w:ascii="Aptos" w:hAnsi="Aptos"/>
+          <w:sz w:val="22"/>
+          <w:lang w:val="es-MX"/>
+        </w:rPr>
+        <w:t>[ ]</w:t>
+      </w:r>
+      <w:proofErr w:type="gramEnd"/>
+      <w:r>
+        <w:rPr>
+          <w:rFonts w:ascii="Aptos" w:hAnsi="Aptos"/>
+          <w:sz w:val="22"/>
+          <w:lang w:val="es-MX"/>
+        </w:rPr>
+        <w:t xml:space="preserve"> </w:t>
       </w:r>
       <w:r>
         <w:rPr>
@@ -426,13 +448,23 @@
           <w:lang w:val="es-MX"/>
         </w:rPr>
       </w:pPr>
-      <w:r>
-        <w:rPr>
-          <w:rFonts w:ascii="Aptos" w:hAnsi="Aptos"/>
-          <w:sz w:val="22"/>
-          <w:lang w:val="es-MX"/>
-        </w:rPr>
-        <w:t xml:space="preserve">[ ] </w:t>
+      <w:proofErr w:type="gramStart"/>
+      <w:r>
+        <w:rPr>
+          <w:rFonts w:ascii="Aptos" w:hAnsi="Aptos"/>
+          <w:sz w:val="22"/>
+          <w:lang w:val="es-MX"/>
+        </w:rPr>
+        <w:t>[ ]</w:t>
+      </w:r>
+      <w:proofErr w:type="gramEnd"/>
+      <w:r>
+        <w:rPr>
+          <w:rFonts w:ascii="Aptos" w:hAnsi="Aptos"/>
+          <w:sz w:val="22"/>
+          <w:lang w:val="es-MX"/>
+        </w:rPr>
+        <w:t xml:space="preserve"> </w:t>
       </w:r>
       <w:r>
         <w:rPr>
@@ -483,13 +515,23 @@
           <w:lang w:val="es-MX"/>
         </w:rPr>
       </w:pPr>
-      <w:r>
-        <w:rPr>
-          <w:rFonts w:ascii="Aptos" w:hAnsi="Aptos"/>
-          <w:sz w:val="22"/>
-          <w:lang w:val="es-MX"/>
-        </w:rPr>
-        <w:t xml:space="preserve">[ ] </w:t>
+      <w:proofErr w:type="gramStart"/>
+      <w:r>
+        <w:rPr>
+          <w:rFonts w:ascii="Aptos" w:hAnsi="Aptos"/>
+          <w:sz w:val="22"/>
+          <w:lang w:val="es-MX"/>
+        </w:rPr>
+        <w:t>[ ]</w:t>
+      </w:r>
+      <w:proofErr w:type="gramEnd"/>
+      <w:r>
+        <w:rPr>
+          <w:rFonts w:ascii="Aptos" w:hAnsi="Aptos"/>
+          <w:sz w:val="22"/>
+          <w:lang w:val="es-MX"/>
+        </w:rPr>
+        <w:t xml:space="preserve"> </w:t>
       </w:r>
       <w:r>
         <w:rPr>
@@ -540,13 +582,23 @@
           <w:lang w:val="es-MX"/>
         </w:rPr>
       </w:pPr>
-      <w:r>
-        <w:rPr>
-          <w:rFonts w:ascii="Aptos" w:hAnsi="Aptos"/>
-          <w:sz w:val="22"/>
-          <w:lang w:val="es-MX"/>
-        </w:rPr>
-        <w:t xml:space="preserve">[ ] </w:t>
+      <w:proofErr w:type="gramStart"/>
+      <w:r>
+        <w:rPr>
+          <w:rFonts w:ascii="Aptos" w:hAnsi="Aptos"/>
+          <w:sz w:val="22"/>
+          <w:lang w:val="es-MX"/>
+        </w:rPr>
+        <w:t>[ ]</w:t>
+      </w:r>
+      <w:proofErr w:type="gramEnd"/>
+      <w:r>
+        <w:rPr>
+          <w:rFonts w:ascii="Aptos" w:hAnsi="Aptos"/>
+          <w:sz w:val="22"/>
+          <w:lang w:val="es-MX"/>
+        </w:rPr>
+        <w:t xml:space="preserve"> </w:t>
       </w:r>
       <w:r>
         <w:rPr>
@@ -697,13 +749,23 @@
         </w:rPr>
         <w:t xml:space="preserve"> </w:t>
       </w:r>
-      <w:r>
-        <w:rPr>
-          <w:rFonts w:ascii="Aptos" w:hAnsi="Aptos"/>
-          <w:sz w:val="22"/>
-          <w:lang w:val="es-MX"/>
-        </w:rPr>
-        <w:t xml:space="preserve">[ ] </w:t>
+      <w:proofErr w:type="gramStart"/>
+      <w:r>
+        <w:rPr>
+          <w:rFonts w:ascii="Aptos" w:hAnsi="Aptos"/>
+          <w:sz w:val="22"/>
+          <w:lang w:val="es-MX"/>
+        </w:rPr>
+        <w:t>[ ]</w:t>
+      </w:r>
+      <w:proofErr w:type="gramEnd"/>
+      <w:r>
+        <w:rPr>
+          <w:rFonts w:ascii="Aptos" w:hAnsi="Aptos"/>
+          <w:sz w:val="22"/>
+          <w:lang w:val="es-MX"/>
+        </w:rPr>
+        <w:t xml:space="preserve"> </w:t>
       </w:r>
       <w:r>
         <w:rPr>
@@ -738,13 +800,23 @@
           <w:lang w:val="es-MX"/>
         </w:rPr>
       </w:pPr>
-      <w:r>
-        <w:rPr>
-          <w:rFonts w:ascii="Aptos" w:hAnsi="Aptos"/>
-          <w:sz w:val="22"/>
-          <w:lang w:val="es-MX"/>
-        </w:rPr>
-        <w:t xml:space="preserve">[ ] </w:t>
+      <w:proofErr w:type="gramStart"/>
+      <w:r>
+        <w:rPr>
+          <w:rFonts w:ascii="Aptos" w:hAnsi="Aptos"/>
+          <w:sz w:val="22"/>
+          <w:lang w:val="es-MX"/>
+        </w:rPr>
+        <w:t>[ ]</w:t>
+      </w:r>
+      <w:proofErr w:type="gramEnd"/>
+      <w:r>
+        <w:rPr>
+          <w:rFonts w:ascii="Aptos" w:hAnsi="Aptos"/>
+          <w:sz w:val="22"/>
+          <w:lang w:val="es-MX"/>
+        </w:rPr>
+        <w:t xml:space="preserve"> </w:t>
       </w:r>
       <w:r>
         <w:rPr>
@@ -813,6 +885,7 @@
           <w:sz w:val="22"/>
         </w:rPr>
       </w:pPr>
+      <w:proofErr w:type="gramStart"/>
       <w:r>
         <w:rPr>
           <w:rFonts w:ascii="Aptos" w:hAnsi="Aptos"/>
@@ -829,6 +902,7 @@
         </w:rPr>
         <w:t xml:space="preserve"> “</w:t>
       </w:r>
+      <w:proofErr w:type="gramEnd"/>
       <w:r>
         <w:rPr>
           <w:rFonts w:ascii="Aptos" w:hAnsi="Aptos"/>
@@ -925,13 +999,23 @@
                 <w:sz w:val="22"/>
               </w:rPr>
             </w:pPr>
+            <w:proofErr w:type="spellStart"/>
             <w:r>
               <w:rPr>
                 <w:rFonts w:ascii="Aptos" w:hAnsi="Aptos"/>
                 <w:b/>
                 <w:sz w:val="22"/>
               </w:rPr>
-              <w:t>Propiedades / Llaves</w:t>
+              <w:t>Propiedades</w:t>
+            </w:r>
+            <w:proofErr w:type="spellEnd"/>
+            <w:r>
+              <w:rPr>
+                <w:rFonts w:ascii="Aptos" w:hAnsi="Aptos"/>
+                <w:b/>
+                <w:sz w:val="22"/>
+              </w:rPr>
+              <w:t xml:space="preserve"> / Llaves</w:t>
             </w:r>
           </w:p>
         </w:tc>
@@ -948,6 +1032,7 @@
                 <w:sz w:val="22"/>
               </w:rPr>
             </w:pPr>
+            <w:proofErr w:type="spellStart"/>
             <w:r>
               <w:rPr>
                 <w:rFonts w:ascii="Aptos" w:hAnsi="Aptos"/>
@@ -962,6 +1047,7 @@
               </w:rPr>
               <w:t>Plaga</w:t>
             </w:r>
+            <w:proofErr w:type="spellEnd"/>
           </w:p>
         </w:tc>
         <w:tc>
@@ -1017,6 +1103,7 @@
                 <w:sz w:val="22"/>
               </w:rPr>
             </w:pPr>
+            <w:proofErr w:type="spellStart"/>
             <w:r>
               <w:rPr>
                 <w:rFonts w:ascii="Aptos" w:hAnsi="Aptos"/>
@@ -1024,19 +1111,21 @@
               </w:rPr>
               <w:t>NombreComun</w:t>
             </w:r>
-          </w:p>
-        </w:tc>
-        <w:tc>
-          <w:tcPr>
-            <w:tcW w:w="3120" w:type="dxa"/>
-          </w:tcPr>
-          <w:p>
-            <w:pPr>
-              <w:rPr>
-                <w:rFonts w:ascii="Aptos" w:hAnsi="Aptos"/>
-                <w:sz w:val="22"/>
-              </w:rPr>
-            </w:pPr>
+            <w:proofErr w:type="spellEnd"/>
+          </w:p>
+        </w:tc>
+        <w:tc>
+          <w:tcPr>
+            <w:tcW w:w="3120" w:type="dxa"/>
+          </w:tcPr>
+          <w:p>
+            <w:pPr>
+              <w:rPr>
+                <w:rFonts w:ascii="Aptos" w:hAnsi="Aptos"/>
+                <w:sz w:val="22"/>
+              </w:rPr>
+            </w:pPr>
+            <w:proofErr w:type="gramStart"/>
             <w:r>
               <w:rPr>
                 <w:rFonts w:ascii="Aptos" w:hAnsi="Aptos"/>
@@ -1044,6 +1133,7 @@
               </w:rPr>
               <w:t>VARCHAR(</w:t>
             </w:r>
+            <w:proofErr w:type="gramEnd"/>
             <w:r>
               <w:rPr>
                 <w:rFonts w:ascii="Aptos" w:hAnsi="Aptos"/>
@@ -1093,6 +1183,7 @@
                 <w:sz w:val="22"/>
               </w:rPr>
             </w:pPr>
+            <w:proofErr w:type="spellStart"/>
             <w:r>
               <w:rPr>
                 <w:rFonts w:ascii="Aptos" w:hAnsi="Aptos"/>
@@ -1100,19 +1191,21 @@
               </w:rPr>
               <w:t>NombreCientifico</w:t>
             </w:r>
-          </w:p>
-        </w:tc>
-        <w:tc>
-          <w:tcPr>
-            <w:tcW w:w="3120" w:type="dxa"/>
-          </w:tcPr>
-          <w:p>
-            <w:pPr>
-              <w:rPr>
-                <w:rFonts w:ascii="Aptos" w:hAnsi="Aptos"/>
-                <w:sz w:val="22"/>
-              </w:rPr>
-            </w:pPr>
+            <w:proofErr w:type="spellEnd"/>
+          </w:p>
+        </w:tc>
+        <w:tc>
+          <w:tcPr>
+            <w:tcW w:w="3120" w:type="dxa"/>
+          </w:tcPr>
+          <w:p>
+            <w:pPr>
+              <w:rPr>
+                <w:rFonts w:ascii="Aptos" w:hAnsi="Aptos"/>
+                <w:sz w:val="22"/>
+              </w:rPr>
+            </w:pPr>
+            <w:proofErr w:type="gramStart"/>
             <w:r>
               <w:rPr>
                 <w:rFonts w:ascii="Aptos" w:hAnsi="Aptos"/>
@@ -1120,6 +1213,7 @@
               </w:rPr>
               <w:t>VARCHAR(</w:t>
             </w:r>
+            <w:proofErr w:type="gramEnd"/>
             <w:r>
               <w:rPr>
                 <w:rFonts w:ascii="Aptos" w:hAnsi="Aptos"/>
@@ -1169,6 +1263,7 @@
                 <w:sz w:val="22"/>
               </w:rPr>
             </w:pPr>
+            <w:proofErr w:type="spellStart"/>
             <w:r>
               <w:rPr>
                 <w:rFonts w:ascii="Aptos" w:hAnsi="Aptos"/>
@@ -1176,25 +1271,35 @@
               </w:rPr>
               <w:t>Categoria</w:t>
             </w:r>
-          </w:p>
-        </w:tc>
-        <w:tc>
-          <w:tcPr>
-            <w:tcW w:w="3120" w:type="dxa"/>
-          </w:tcPr>
-          <w:p>
-            <w:pPr>
-              <w:rPr>
-                <w:rFonts w:ascii="Aptos" w:hAnsi="Aptos"/>
-                <w:sz w:val="22"/>
-              </w:rPr>
-            </w:pPr>
-            <w:r>
-              <w:rPr>
-                <w:rFonts w:ascii="Aptos" w:hAnsi="Aptos"/>
-                <w:sz w:val="22"/>
-              </w:rPr>
-              <w:t>VARCHAR(50)</w:t>
+            <w:proofErr w:type="spellEnd"/>
+          </w:p>
+        </w:tc>
+        <w:tc>
+          <w:tcPr>
+            <w:tcW w:w="3120" w:type="dxa"/>
+          </w:tcPr>
+          <w:p>
+            <w:pPr>
+              <w:rPr>
+                <w:rFonts w:ascii="Aptos" w:hAnsi="Aptos"/>
+                <w:sz w:val="22"/>
+              </w:rPr>
+            </w:pPr>
+            <w:proofErr w:type="gramStart"/>
+            <w:r>
+              <w:rPr>
+                <w:rFonts w:ascii="Aptos" w:hAnsi="Aptos"/>
+                <w:sz w:val="22"/>
+              </w:rPr>
+              <w:t>VARCHAR(</w:t>
+            </w:r>
+            <w:proofErr w:type="gramEnd"/>
+            <w:r>
+              <w:rPr>
+                <w:rFonts w:ascii="Aptos" w:hAnsi="Aptos"/>
+                <w:sz w:val="22"/>
+              </w:rPr>
+              <w:t>50)</w:t>
             </w:r>
           </w:p>
         </w:tc>
@@ -1231,6 +1336,7 @@
                 <w:sz w:val="22"/>
               </w:rPr>
             </w:pPr>
+            <w:proofErr w:type="spellStart"/>
             <w:r>
               <w:rPr>
                 <w:rFonts w:ascii="Aptos" w:hAnsi="Aptos"/>
@@ -1238,25 +1344,35 @@
               </w:rPr>
               <w:t>NivelRiesgo</w:t>
             </w:r>
-          </w:p>
-        </w:tc>
-        <w:tc>
-          <w:tcPr>
-            <w:tcW w:w="3120" w:type="dxa"/>
-          </w:tcPr>
-          <w:p>
-            <w:pPr>
-              <w:rPr>
-                <w:rFonts w:ascii="Aptos" w:hAnsi="Aptos"/>
-                <w:sz w:val="22"/>
-              </w:rPr>
-            </w:pPr>
-            <w:r>
-              <w:rPr>
-                <w:rFonts w:ascii="Aptos" w:hAnsi="Aptos"/>
-                <w:sz w:val="22"/>
-              </w:rPr>
-              <w:t>VARCHAR(50)</w:t>
+            <w:proofErr w:type="spellEnd"/>
+          </w:p>
+        </w:tc>
+        <w:tc>
+          <w:tcPr>
+            <w:tcW w:w="3120" w:type="dxa"/>
+          </w:tcPr>
+          <w:p>
+            <w:pPr>
+              <w:rPr>
+                <w:rFonts w:ascii="Aptos" w:hAnsi="Aptos"/>
+                <w:sz w:val="22"/>
+              </w:rPr>
+            </w:pPr>
+            <w:proofErr w:type="gramStart"/>
+            <w:r>
+              <w:rPr>
+                <w:rFonts w:ascii="Aptos" w:hAnsi="Aptos"/>
+                <w:sz w:val="22"/>
+              </w:rPr>
+              <w:t>VARCHAR(</w:t>
+            </w:r>
+            <w:proofErr w:type="gramEnd"/>
+            <w:r>
+              <w:rPr>
+                <w:rFonts w:ascii="Aptos" w:hAnsi="Aptos"/>
+                <w:sz w:val="22"/>
+              </w:rPr>
+              <w:t>50)</w:t>
             </w:r>
           </w:p>
         </w:tc>
@@ -1293,6 +1409,7 @@
                 <w:sz w:val="22"/>
               </w:rPr>
             </w:pPr>
+            <w:proofErr w:type="spellStart"/>
             <w:r>
               <w:rPr>
                 <w:rFonts w:ascii="Aptos" w:hAnsi="Aptos"/>
@@ -1300,6 +1417,7 @@
               </w:rPr>
               <w:t>UrlImage</w:t>
             </w:r>
+            <w:proofErr w:type="spellEnd"/>
           </w:p>
         </w:tc>
         <w:tc>
@@ -1319,6 +1437,70 @@
                 <w:sz w:val="22"/>
               </w:rPr>
               <w:t>VARCHAR(MAX)</w:t>
+            </w:r>
+          </w:p>
+        </w:tc>
+        <w:tc>
+          <w:tcPr>
+            <w:tcW w:w="3120" w:type="dxa"/>
+          </w:tcPr>
+          <w:p>
+            <w:pPr>
+              <w:rPr>
+                <w:rFonts w:ascii="Aptos" w:hAnsi="Aptos"/>
+                <w:sz w:val="22"/>
+              </w:rPr>
+            </w:pPr>
+            <w:r>
+              <w:rPr>
+                <w:rFonts w:ascii="Aptos" w:hAnsi="Aptos"/>
+                <w:sz w:val="22"/>
+              </w:rPr>
+              <w:t>NULL</w:t>
+            </w:r>
+          </w:p>
+        </w:tc>
+      </w:tr>
+      <w:tr>
+        <w:tc>
+          <w:tcPr>
+            <w:tcW w:w="3120" w:type="dxa"/>
+          </w:tcPr>
+          <w:p>
+            <w:pPr>
+              <w:rPr>
+                <w:rFonts w:ascii="Aptos" w:hAnsi="Aptos"/>
+                <w:sz w:val="22"/>
+              </w:rPr>
+            </w:pPr>
+            <w:proofErr w:type="spellStart"/>
+            <w:r>
+              <w:rPr>
+                <w:rFonts w:ascii="Aptos" w:hAnsi="Aptos"/>
+                <w:sz w:val="22"/>
+              </w:rPr>
+              <w:t>Enfermedades</w:t>
+            </w:r>
+            <w:proofErr w:type="spellEnd"/>
+          </w:p>
+        </w:tc>
+        <w:tc>
+          <w:tcPr>
+            <w:tcW w:w="3120" w:type="dxa"/>
+          </w:tcPr>
+          <w:p>
+            <w:pPr>
+              <w:rPr>
+                <w:rFonts w:ascii="Aptos" w:hAnsi="Aptos"/>
+                <w:sz w:val="22"/>
+              </w:rPr>
+            </w:pPr>
+            <w:r>
+              <w:rPr>
+                <w:rFonts w:ascii="Aptos" w:hAnsi="Aptos"/>
+                <w:sz w:val="22"/>
+              </w:rPr>
+              <w:t>TEXT</w:t>
             </w:r>
           </w:p>
         </w:tc>
@@ -1472,13 +1654,23 @@
                 <w:sz w:val="22"/>
               </w:rPr>
             </w:pPr>
+            <w:proofErr w:type="spellStart"/>
             <w:r>
               <w:rPr>
                 <w:rFonts w:ascii="Aptos" w:hAnsi="Aptos"/>
                 <w:b/>
                 <w:sz w:val="22"/>
               </w:rPr>
-              <w:t>Propiedades / Llaves</w:t>
+              <w:t>Propiedades</w:t>
+            </w:r>
+            <w:proofErr w:type="spellEnd"/>
+            <w:r>
+              <w:rPr>
+                <w:rFonts w:ascii="Aptos" w:hAnsi="Aptos"/>
+                <w:b/>
+                <w:sz w:val="22"/>
+              </w:rPr>
+              <w:t xml:space="preserve"> / Llaves</w:t>
             </w:r>
           </w:p>
         </w:tc>
@@ -1495,11 +1687,13 @@
                 <w:sz w:val="22"/>
               </w:rPr>
             </w:pPr>
-            <w:r>
-              <w:rPr>
-                <w:rFonts w:ascii="Aptos" w:hAnsi="Aptos"/>
-                <w:sz w:val="22"/>
-              </w:rPr>
+            <w:proofErr w:type="spellStart"/>
+            <w:r>
+              <w:rPr>
+                <w:rFonts w:ascii="Aptos" w:hAnsi="Aptos"/>
+                <w:sz w:val="22"/>
+              </w:rPr>
+              <w:lastRenderedPageBreak/>
               <w:t>Id</w:t>
             </w:r>
             <w:r>
@@ -1509,6 +1703,7 @@
               </w:rPr>
               <w:t>Prevencion</w:t>
             </w:r>
+            <w:proofErr w:type="spellEnd"/>
           </w:p>
         </w:tc>
         <w:tc>
@@ -1564,14 +1759,15 @@
                 <w:sz w:val="22"/>
               </w:rPr>
             </w:pPr>
-            <w:r>
-              <w:rPr>
-                <w:rFonts w:ascii="Aptos" w:hAnsi="Aptos"/>
-                <w:sz w:val="22"/>
-              </w:rPr>
-              <w:lastRenderedPageBreak/>
+            <w:proofErr w:type="spellStart"/>
+            <w:r>
+              <w:rPr>
+                <w:rFonts w:ascii="Aptos" w:hAnsi="Aptos"/>
+                <w:sz w:val="22"/>
+              </w:rPr>
               <w:t>IdPlaga</w:t>
             </w:r>
+            <w:proofErr w:type="spellEnd"/>
           </w:p>
         </w:tc>
         <w:tc>
@@ -1627,6 +1823,7 @@
                 <w:sz w:val="22"/>
               </w:rPr>
             </w:pPr>
+            <w:proofErr w:type="spellStart"/>
             <w:r>
               <w:rPr>
                 <w:rFonts w:ascii="Aptos" w:hAnsi="Aptos"/>
@@ -1634,19 +1831,21 @@
               </w:rPr>
               <w:t>Titulo</w:t>
             </w:r>
-          </w:p>
-        </w:tc>
-        <w:tc>
-          <w:tcPr>
-            <w:tcW w:w="3120" w:type="dxa"/>
-          </w:tcPr>
-          <w:p>
-            <w:pPr>
-              <w:rPr>
-                <w:rFonts w:ascii="Aptos" w:hAnsi="Aptos"/>
-                <w:sz w:val="22"/>
-              </w:rPr>
-            </w:pPr>
+            <w:proofErr w:type="spellEnd"/>
+          </w:p>
+        </w:tc>
+        <w:tc>
+          <w:tcPr>
+            <w:tcW w:w="3120" w:type="dxa"/>
+          </w:tcPr>
+          <w:p>
+            <w:pPr>
+              <w:rPr>
+                <w:rFonts w:ascii="Aptos" w:hAnsi="Aptos"/>
+                <w:sz w:val="22"/>
+              </w:rPr>
+            </w:pPr>
+            <w:proofErr w:type="gramStart"/>
             <w:r>
               <w:rPr>
                 <w:rFonts w:ascii="Aptos" w:hAnsi="Aptos"/>
@@ -1654,6 +1853,7 @@
               </w:rPr>
               <w:t>VARCHAR(</w:t>
             </w:r>
+            <w:proofErr w:type="gramEnd"/>
             <w:r>
               <w:rPr>
                 <w:rFonts w:ascii="Aptos" w:hAnsi="Aptos"/>
@@ -1703,6 +1903,7 @@
                 <w:sz w:val="22"/>
               </w:rPr>
             </w:pPr>
+            <w:proofErr w:type="spellStart"/>
             <w:r>
               <w:rPr>
                 <w:rFonts w:ascii="Aptos" w:hAnsi="Aptos"/>
@@ -1710,6 +1911,7 @@
               </w:rPr>
               <w:t>Descripcion</w:t>
             </w:r>
+            <w:proofErr w:type="spellEnd"/>
           </w:p>
         </w:tc>
         <w:tc>
@@ -1891,13 +2093,23 @@
                 <w:sz w:val="22"/>
               </w:rPr>
             </w:pPr>
+            <w:proofErr w:type="spellStart"/>
             <w:r>
               <w:rPr>
                 <w:rFonts w:ascii="Aptos" w:hAnsi="Aptos"/>
                 <w:b/>
                 <w:sz w:val="22"/>
               </w:rPr>
-              <w:t>Propiedades / Llaves</w:t>
+              <w:t>Propiedades</w:t>
+            </w:r>
+            <w:proofErr w:type="spellEnd"/>
+            <w:r>
+              <w:rPr>
+                <w:rFonts w:ascii="Aptos" w:hAnsi="Aptos"/>
+                <w:b/>
+                <w:sz w:val="22"/>
+              </w:rPr>
+              <w:t xml:space="preserve"> / Llaves</w:t>
             </w:r>
           </w:p>
         </w:tc>
@@ -1914,6 +2126,7 @@
                 <w:sz w:val="22"/>
               </w:rPr>
             </w:pPr>
+            <w:proofErr w:type="spellStart"/>
             <w:r>
               <w:rPr>
                 <w:rFonts w:ascii="Aptos" w:hAnsi="Aptos"/>
@@ -1928,6 +2141,7 @@
               </w:rPr>
               <w:t>Tratamiento</w:t>
             </w:r>
+            <w:proofErr w:type="spellEnd"/>
           </w:p>
         </w:tc>
         <w:tc>
@@ -1983,6 +2197,7 @@
                 <w:sz w:val="22"/>
               </w:rPr>
             </w:pPr>
+            <w:proofErr w:type="spellStart"/>
             <w:r>
               <w:rPr>
                 <w:rFonts w:ascii="Aptos" w:hAnsi="Aptos"/>
@@ -2004,6 +2219,7 @@
               </w:rPr>
               <w:t>laga</w:t>
             </w:r>
+            <w:proofErr w:type="spellEnd"/>
           </w:p>
         </w:tc>
         <w:tc>
@@ -2079,12 +2295,21 @@
                 <w:sz w:val="22"/>
               </w:rPr>
             </w:pPr>
-            <w:r>
-              <w:rPr>
-                <w:rFonts w:ascii="Aptos" w:hAnsi="Aptos"/>
-                <w:sz w:val="22"/>
-              </w:rPr>
-              <w:t>VARCHAR(50)</w:t>
+            <w:proofErr w:type="gramStart"/>
+            <w:r>
+              <w:rPr>
+                <w:rFonts w:ascii="Aptos" w:hAnsi="Aptos"/>
+                <w:sz w:val="22"/>
+              </w:rPr>
+              <w:t>VARCHAR(</w:t>
+            </w:r>
+            <w:proofErr w:type="gramEnd"/>
+            <w:r>
+              <w:rPr>
+                <w:rFonts w:ascii="Aptos" w:hAnsi="Aptos"/>
+                <w:sz w:val="22"/>
+              </w:rPr>
+              <w:t>50)</w:t>
             </w:r>
           </w:p>
         </w:tc>
@@ -2121,6 +2346,7 @@
                 <w:sz w:val="22"/>
               </w:rPr>
             </w:pPr>
+            <w:proofErr w:type="spellStart"/>
             <w:r>
               <w:rPr>
                 <w:rFonts w:ascii="Aptos" w:hAnsi="Aptos"/>
@@ -2128,25 +2354,35 @@
               </w:rPr>
               <w:t>NombreProducto</w:t>
             </w:r>
-          </w:p>
-        </w:tc>
-        <w:tc>
-          <w:tcPr>
-            <w:tcW w:w="3120" w:type="dxa"/>
-          </w:tcPr>
-          <w:p>
-            <w:pPr>
-              <w:rPr>
-                <w:rFonts w:ascii="Aptos" w:hAnsi="Aptos"/>
-                <w:sz w:val="22"/>
-              </w:rPr>
-            </w:pPr>
-            <w:r>
-              <w:rPr>
-                <w:rFonts w:ascii="Aptos" w:hAnsi="Aptos"/>
-                <w:sz w:val="22"/>
-              </w:rPr>
-              <w:t>VARCHAR(100)</w:t>
+            <w:proofErr w:type="spellEnd"/>
+          </w:p>
+        </w:tc>
+        <w:tc>
+          <w:tcPr>
+            <w:tcW w:w="3120" w:type="dxa"/>
+          </w:tcPr>
+          <w:p>
+            <w:pPr>
+              <w:rPr>
+                <w:rFonts w:ascii="Aptos" w:hAnsi="Aptos"/>
+                <w:sz w:val="22"/>
+              </w:rPr>
+            </w:pPr>
+            <w:proofErr w:type="gramStart"/>
+            <w:r>
+              <w:rPr>
+                <w:rFonts w:ascii="Aptos" w:hAnsi="Aptos"/>
+                <w:sz w:val="22"/>
+              </w:rPr>
+              <w:t>VARCHAR(</w:t>
+            </w:r>
+            <w:proofErr w:type="gramEnd"/>
+            <w:r>
+              <w:rPr>
+                <w:rFonts w:ascii="Aptos" w:hAnsi="Aptos"/>
+                <w:sz w:val="22"/>
+              </w:rPr>
+              <w:t>100)</w:t>
             </w:r>
           </w:p>
         </w:tc>
@@ -2183,6 +2419,7 @@
                 <w:sz w:val="22"/>
               </w:rPr>
             </w:pPr>
+            <w:proofErr w:type="spellStart"/>
             <w:r>
               <w:rPr>
                 <w:rFonts w:ascii="Aptos" w:hAnsi="Aptos"/>
@@ -2190,6 +2427,7 @@
               </w:rPr>
               <w:t>Instrucciones</w:t>
             </w:r>
+            <w:proofErr w:type="spellEnd"/>
           </w:p>
         </w:tc>
         <w:tc>
@@ -2437,11 +2675,19 @@
                 <w:rFonts w:ascii="Aptos" w:eastAsia="Aptos" w:hAnsi="Aptos" w:cs="Aptos"/>
               </w:rPr>
             </w:pPr>
-            <w:r>
-              <w:rPr>
-                <w:rFonts w:ascii="Aptos" w:eastAsia="Aptos" w:hAnsi="Aptos" w:cs="Aptos"/>
-              </w:rPr>
-              <w:t>Fecha: 2026/0</w:t>
+            <w:proofErr w:type="spellStart"/>
+            <w:r>
+              <w:rPr>
+                <w:rFonts w:ascii="Aptos" w:eastAsia="Aptos" w:hAnsi="Aptos" w:cs="Aptos"/>
+              </w:rPr>
+              <w:t>Fecha</w:t>
+            </w:r>
+            <w:proofErr w:type="spellEnd"/>
+            <w:r>
+              <w:rPr>
+                <w:rFonts w:ascii="Aptos" w:eastAsia="Aptos" w:hAnsi="Aptos" w:cs="Aptos"/>
+              </w:rPr>
+              <w:t>: 2026/0</w:t>
             </w:r>
             <w:r>
               <w:rPr>
@@ -2480,11 +2726,19 @@
                 <w:rFonts w:ascii="Aptos" w:eastAsia="Aptos" w:hAnsi="Aptos" w:cs="Aptos"/>
               </w:rPr>
             </w:pPr>
-            <w:r>
-              <w:rPr>
-                <w:rFonts w:ascii="Aptos" w:eastAsia="Aptos" w:hAnsi="Aptos" w:cs="Aptos"/>
-              </w:rPr>
-              <w:t>Fecha: 2026/0</w:t>
+            <w:proofErr w:type="spellStart"/>
+            <w:r>
+              <w:rPr>
+                <w:rFonts w:ascii="Aptos" w:eastAsia="Aptos" w:hAnsi="Aptos" w:cs="Aptos"/>
+              </w:rPr>
+              <w:t>Fecha</w:t>
+            </w:r>
+            <w:proofErr w:type="spellEnd"/>
+            <w:r>
+              <w:rPr>
+                <w:rFonts w:ascii="Aptos" w:eastAsia="Aptos" w:hAnsi="Aptos" w:cs="Aptos"/>
+              </w:rPr>
+              <w:t>: 2026/0</w:t>
             </w:r>
             <w:r>
               <w:rPr>
@@ -2525,12 +2779,14 @@
                 <w:rFonts w:ascii="Aptos" w:eastAsia="Aptos" w:hAnsi="Aptos" w:cs="Aptos"/>
               </w:rPr>
             </w:pPr>
+            <w:proofErr w:type="spellStart"/>
             <w:r>
               <w:rPr>
                 <w:rFonts w:ascii="Aptos" w:eastAsia="Aptos" w:hAnsi="Aptos" w:cs="Aptos"/>
               </w:rPr>
               <w:t>Firma</w:t>
             </w:r>
+            <w:proofErr w:type="spellEnd"/>
           </w:p>
         </w:tc>
         <w:tc>
@@ -2544,12 +2800,14 @@
                 <w:rFonts w:ascii="Aptos" w:eastAsia="Aptos" w:hAnsi="Aptos" w:cs="Aptos"/>
               </w:rPr>
             </w:pPr>
+            <w:proofErr w:type="spellStart"/>
             <w:r>
               <w:rPr>
                 <w:rFonts w:ascii="Aptos" w:eastAsia="Aptos" w:hAnsi="Aptos" w:cs="Aptos"/>
               </w:rPr>
               <w:t>Firma</w:t>
             </w:r>
+            <w:proofErr w:type="spellEnd"/>
           </w:p>
         </w:tc>
       </w:tr>
@@ -2591,11 +2849,19 @@
                 <w:rFonts w:ascii="Aptos" w:eastAsia="Aptos" w:hAnsi="Aptos" w:cs="Aptos"/>
               </w:rPr>
             </w:pPr>
-            <w:r>
-              <w:rPr>
-                <w:rFonts w:ascii="Aptos" w:eastAsia="Aptos" w:hAnsi="Aptos" w:cs="Aptos"/>
-              </w:rPr>
-              <w:t xml:space="preserve">Revisión </w:t>
+            <w:proofErr w:type="spellStart"/>
+            <w:r>
+              <w:rPr>
+                <w:rFonts w:ascii="Aptos" w:eastAsia="Aptos" w:hAnsi="Aptos" w:cs="Aptos"/>
+              </w:rPr>
+              <w:t>Revisión</w:t>
+            </w:r>
+            <w:proofErr w:type="spellEnd"/>
+            <w:r>
+              <w:rPr>
+                <w:rFonts w:ascii="Aptos" w:eastAsia="Aptos" w:hAnsi="Aptos" w:cs="Aptos"/>
+              </w:rPr>
+              <w:t xml:space="preserve"> </w:t>
             </w:r>
           </w:p>
         </w:tc>
@@ -2631,7 +2897,21 @@
               <w:rPr>
                 <w:rFonts w:ascii="Aptos" w:eastAsia="Aptos" w:hAnsi="Aptos" w:cs="Aptos"/>
               </w:rPr>
-              <w:t xml:space="preserve">2 Paginas </w:t>
+              <w:t xml:space="preserve">2 </w:t>
+            </w:r>
+            <w:proofErr w:type="spellStart"/>
+            <w:r>
+              <w:rPr>
+                <w:rFonts w:ascii="Aptos" w:eastAsia="Aptos" w:hAnsi="Aptos" w:cs="Aptos"/>
+              </w:rPr>
+              <w:t>Paginas</w:t>
+            </w:r>
+            <w:proofErr w:type="spellEnd"/>
+            <w:r>
+              <w:rPr>
+                <w:rFonts w:ascii="Aptos" w:eastAsia="Aptos" w:hAnsi="Aptos" w:cs="Aptos"/>
+              </w:rPr>
+              <w:t xml:space="preserve"> </w:t>
             </w:r>
           </w:p>
         </w:tc>
@@ -2649,8 +2929,30 @@
               <w:rPr>
                 <w:rFonts w:ascii="Aptos" w:eastAsia="Aptos" w:hAnsi="Aptos" w:cs="Aptos"/>
               </w:rPr>
-              <w:t>Todo el documento</w:t>
-            </w:r>
+              <w:t xml:space="preserve">Todo </w:t>
+            </w:r>
+            <w:proofErr w:type="spellStart"/>
+            <w:r>
+              <w:rPr>
+                <w:rFonts w:ascii="Aptos" w:eastAsia="Aptos" w:hAnsi="Aptos" w:cs="Aptos"/>
+              </w:rPr>
+              <w:t>el</w:t>
+            </w:r>
+            <w:proofErr w:type="spellEnd"/>
+            <w:r>
+              <w:rPr>
+                <w:rFonts w:ascii="Aptos" w:eastAsia="Aptos" w:hAnsi="Aptos" w:cs="Aptos"/>
+              </w:rPr>
+              <w:t xml:space="preserve"> </w:t>
+            </w:r>
+            <w:proofErr w:type="spellStart"/>
+            <w:r>
+              <w:rPr>
+                <w:rFonts w:ascii="Aptos" w:eastAsia="Aptos" w:hAnsi="Aptos" w:cs="Aptos"/>
+              </w:rPr>
+              <w:t>documento</w:t>
+            </w:r>
+            <w:proofErr w:type="spellEnd"/>
           </w:p>
         </w:tc>
         <w:tc>
@@ -2663,12 +2965,42 @@
                 <w:rFonts w:ascii="Aptos" w:eastAsia="Aptos" w:hAnsi="Aptos" w:cs="Aptos"/>
               </w:rPr>
             </w:pPr>
-            <w:r>
-              <w:rPr>
-                <w:rFonts w:ascii="Aptos" w:eastAsia="Aptos" w:hAnsi="Aptos" w:cs="Aptos"/>
-              </w:rPr>
-              <w:t>Emisión del documento inicial</w:t>
-            </w:r>
+            <w:proofErr w:type="spellStart"/>
+            <w:r>
+              <w:rPr>
+                <w:rFonts w:ascii="Aptos" w:eastAsia="Aptos" w:hAnsi="Aptos" w:cs="Aptos"/>
+              </w:rPr>
+              <w:t>Emisión</w:t>
+            </w:r>
+            <w:proofErr w:type="spellEnd"/>
+            <w:r>
+              <w:rPr>
+                <w:rFonts w:ascii="Aptos" w:eastAsia="Aptos" w:hAnsi="Aptos" w:cs="Aptos"/>
+              </w:rPr>
+              <w:t xml:space="preserve"> del </w:t>
+            </w:r>
+            <w:proofErr w:type="spellStart"/>
+            <w:r>
+              <w:rPr>
+                <w:rFonts w:ascii="Aptos" w:eastAsia="Aptos" w:hAnsi="Aptos" w:cs="Aptos"/>
+              </w:rPr>
+              <w:t>documento</w:t>
+            </w:r>
+            <w:proofErr w:type="spellEnd"/>
+            <w:r>
+              <w:rPr>
+                <w:rFonts w:ascii="Aptos" w:eastAsia="Aptos" w:hAnsi="Aptos" w:cs="Aptos"/>
+              </w:rPr>
+              <w:t xml:space="preserve"> </w:t>
+            </w:r>
+            <w:proofErr w:type="spellStart"/>
+            <w:r>
+              <w:rPr>
+                <w:rFonts w:ascii="Aptos" w:eastAsia="Aptos" w:hAnsi="Aptos" w:cs="Aptos"/>
+              </w:rPr>
+              <w:t>inicial</w:t>
+            </w:r>
+            <w:proofErr w:type="spellEnd"/>
           </w:p>
         </w:tc>
         <w:tc>

</xml_diff>